<commit_message>
Agregar colores a la interfaz grafica en terminal
</commit_message>
<xml_diff>
--- a/pruebas/Pruebas.docx
+++ b/pruebas/Pruebas.docx
@@ -269,14 +269,12 @@
               </w:rPr>
               <w:t xml:space="preserve">Bienvenido, Pepito (Administrador). Abre el </w:t>
             </w:r>
-            <w:proofErr w:type="spellStart"/>
-            <w:r>
-              <w:rPr>
-                <w:lang w:val="es-CO"/>
-              </w:rPr>
-              <w:t>menu</w:t>
-            </w:r>
-            <w:proofErr w:type="spellEnd"/>
+            <w:r>
+              <w:rPr>
+                <w:lang w:val="es-CO"/>
+              </w:rPr>
+              <w:t>menú</w:t>
+            </w:r>
             <w:r>
               <w:rPr>
                 <w:lang w:val="es-CO"/>
@@ -490,6 +488,7 @@
               <w:t xml:space="preserve">Herramienta creada con id 3. Queda guardada en </w:t>
             </w:r>
             <w:proofErr w:type="spellStart"/>
+            <w:proofErr w:type="gramStart"/>
             <w:r>
               <w:rPr>
                 <w:lang w:val="es-CO"/>
@@ -497,6 +496,7 @@
               <w:t>herramientas.json</w:t>
             </w:r>
             <w:proofErr w:type="spellEnd"/>
+            <w:proofErr w:type="gramEnd"/>
             <w:r>
               <w:rPr>
                 <w:lang w:val="es-CO"/>
@@ -780,14 +780,12 @@
               </w:rPr>
               <w:t xml:space="preserve">No se puede dejar </w:t>
             </w:r>
-            <w:proofErr w:type="spellStart"/>
-            <w:r>
-              <w:rPr>
-                <w:lang w:val="es-CO"/>
-              </w:rPr>
-              <w:t>vacio</w:t>
-            </w:r>
-            <w:proofErr w:type="spellEnd"/>
+            <w:r>
+              <w:rPr>
+                <w:lang w:val="es-CO"/>
+              </w:rPr>
+              <w:t>vacío</w:t>
+            </w:r>
             <w:r>
               <w:rPr>
                 <w:lang w:val="es-CO"/>
@@ -902,14 +900,12 @@
               </w:rPr>
               <w:t xml:space="preserve">Esa </w:t>
             </w:r>
-            <w:proofErr w:type="spellStart"/>
-            <w:r>
-              <w:rPr>
-                <w:lang w:val="es-CO"/>
-              </w:rPr>
-              <w:t>opcion</w:t>
-            </w:r>
-            <w:proofErr w:type="spellEnd"/>
+            <w:r>
+              <w:rPr>
+                <w:lang w:val="es-CO"/>
+              </w:rPr>
+              <w:t>opción</w:t>
+            </w:r>
             <w:r>
               <w:rPr>
                 <w:lang w:val="es-CO"/>
@@ -1584,29 +1580,25 @@
               </w:rPr>
               <w:t xml:space="preserve">, </w:t>
             </w:r>
-            <w:proofErr w:type="spellStart"/>
             <w:r>
               <w:rPr>
                 <w:lang w:val="es-CO"/>
               </w:rPr>
               <w:lastRenderedPageBreak/>
-              <w:t>telefono</w:t>
-            </w:r>
-            <w:proofErr w:type="spellEnd"/>
+              <w:t>teléfono</w:t>
+            </w:r>
             <w:r>
               <w:rPr>
                 <w:lang w:val="es-CO"/>
               </w:rPr>
               <w:t xml:space="preserve"> = 3001234567, </w:t>
             </w:r>
-            <w:proofErr w:type="spellStart"/>
-            <w:r>
-              <w:rPr>
-                <w:lang w:val="es-CO"/>
-              </w:rPr>
-              <w:t>direccion</w:t>
-            </w:r>
-            <w:proofErr w:type="spellEnd"/>
+            <w:r>
+              <w:rPr>
+                <w:lang w:val="es-CO"/>
+              </w:rPr>
+              <w:t>dirección</w:t>
+            </w:r>
             <w:r>
               <w:rPr>
                 <w:lang w:val="es-CO"/>
@@ -1662,6 +1654,7 @@
               <w:t xml:space="preserve">Usuario creado con id 4. Queda guardado en </w:t>
             </w:r>
             <w:proofErr w:type="spellStart"/>
+            <w:proofErr w:type="gramStart"/>
             <w:r>
               <w:rPr>
                 <w:lang w:val="es-CO"/>
@@ -1670,6 +1663,7 @@
               <w:t>usuarios.json</w:t>
             </w:r>
             <w:proofErr w:type="spellEnd"/>
+            <w:proofErr w:type="gramEnd"/>
             <w:r>
               <w:rPr>
                 <w:lang w:val="es-CO"/>
@@ -2706,14 +2700,12 @@
               </w:rPr>
               <w:t xml:space="preserve">Un usuario solicita </w:t>
             </w:r>
-            <w:proofErr w:type="spellStart"/>
-            <w:r>
-              <w:rPr>
-                <w:lang w:val="es-CO"/>
-              </w:rPr>
-              <w:t>mas</w:t>
-            </w:r>
-            <w:proofErr w:type="spellEnd"/>
+            <w:r>
+              <w:rPr>
+                <w:lang w:val="es-CO"/>
+              </w:rPr>
+              <w:t>más</w:t>
+            </w:r>
             <w:r>
               <w:rPr>
                 <w:lang w:val="es-CO"/>
@@ -2827,7 +2819,15 @@
             </w:r>
             <w:proofErr w:type="spellEnd"/>
             <w:r>
-              <w:t xml:space="preserve"> = 4, opcion = 1</w:t>
+              <w:t xml:space="preserve"> = 4, </w:t>
+            </w:r>
+            <w:proofErr w:type="spellStart"/>
+            <w:r>
+              <w:t>opcion</w:t>
+            </w:r>
+            <w:proofErr w:type="spellEnd"/>
+            <w:r>
+              <w:t xml:space="preserve"> = 1</w:t>
             </w:r>
           </w:p>
         </w:tc>
@@ -3053,14 +3053,12 @@
               </w:rPr>
               <w:t xml:space="preserve">Reporte de </w:t>
             </w:r>
-            <w:proofErr w:type="spellStart"/>
-            <w:r>
-              <w:rPr>
-                <w:lang w:val="es-CO"/>
-              </w:rPr>
-              <w:t>prestamos</w:t>
-            </w:r>
-            <w:proofErr w:type="spellEnd"/>
+            <w:r>
+              <w:rPr>
+                <w:lang w:val="es-CO"/>
+              </w:rPr>
+              <w:t>préstamos</w:t>
+            </w:r>
             <w:r>
               <w:rPr>
                 <w:lang w:val="es-CO"/>

</xml_diff>

<commit_message>
Agregar pin seguridad al admin
</commit_message>
<xml_diff>
--- a/pruebas/Pruebas.docx
+++ b/pruebas/Pruebas.docx
@@ -113,7 +113,7 @@
       <w:tr>
         <w:tc>
           <w:tcPr>
-            <w:tcW w:w="567" w:type="dxa"/>
+            <w:tcW w:w="554" w:type="dxa"/>
           </w:tcPr>
           <w:p>
             <w:r>
@@ -126,7 +126,7 @@
         </w:tc>
         <w:tc>
           <w:tcPr>
-            <w:tcW w:w="3118" w:type="dxa"/>
+            <w:tcW w:w="2965" w:type="dxa"/>
           </w:tcPr>
           <w:p>
             <w:r>
@@ -139,7 +139,7 @@
         </w:tc>
         <w:tc>
           <w:tcPr>
-            <w:tcW w:w="3402" w:type="dxa"/>
+            <w:tcW w:w="3224" w:type="dxa"/>
           </w:tcPr>
           <w:p>
             <w:r>
@@ -152,7 +152,7 @@
         </w:tc>
         <w:tc>
           <w:tcPr>
-            <w:tcW w:w="1701" w:type="dxa"/>
+            <w:tcW w:w="1629" w:type="dxa"/>
           </w:tcPr>
           <w:p>
             <w:r>
@@ -165,7 +165,7 @@
         </w:tc>
         <w:tc>
           <w:tcPr>
-            <w:tcW w:w="4535" w:type="dxa"/>
+            <w:tcW w:w="4289" w:type="dxa"/>
           </w:tcPr>
           <w:p>
             <w:r>
@@ -178,7 +178,7 @@
         </w:tc>
         <w:tc>
           <w:tcPr>
-            <w:tcW w:w="1134" w:type="dxa"/>
+            <w:tcW w:w="1127" w:type="dxa"/>
           </w:tcPr>
           <w:p>
             <w:r>
@@ -193,7 +193,7 @@
       <w:tr>
         <w:tc>
           <w:tcPr>
-            <w:tcW w:w="567" w:type="dxa"/>
+            <w:tcW w:w="554" w:type="dxa"/>
           </w:tcPr>
           <w:p>
             <w:r>
@@ -203,7 +203,7 @@
         </w:tc>
         <w:tc>
           <w:tcPr>
-            <w:tcW w:w="3118" w:type="dxa"/>
+            <w:tcW w:w="2965" w:type="dxa"/>
           </w:tcPr>
           <w:p>
             <w:pPr>
@@ -235,7 +235,7 @@
         </w:tc>
         <w:tc>
           <w:tcPr>
-            <w:tcW w:w="3402" w:type="dxa"/>
+            <w:tcW w:w="3224" w:type="dxa"/>
           </w:tcPr>
           <w:p>
             <w:r>
@@ -245,7 +245,7 @@
         </w:tc>
         <w:tc>
           <w:tcPr>
-            <w:tcW w:w="1701" w:type="dxa"/>
+            <w:tcW w:w="1629" w:type="dxa"/>
           </w:tcPr>
           <w:p>
             <w:r>
@@ -255,7 +255,7 @@
         </w:tc>
         <w:tc>
           <w:tcPr>
-            <w:tcW w:w="4535" w:type="dxa"/>
+            <w:tcW w:w="4289" w:type="dxa"/>
           </w:tcPr>
           <w:p>
             <w:pPr>
@@ -285,7 +285,7 @@
         </w:tc>
         <w:tc>
           <w:tcPr>
-            <w:tcW w:w="1134" w:type="dxa"/>
+            <w:tcW w:w="1127" w:type="dxa"/>
           </w:tcPr>
           <w:p>
             <w:r>
@@ -297,7 +297,7 @@
       <w:tr>
         <w:tc>
           <w:tcPr>
-            <w:tcW w:w="567" w:type="dxa"/>
+            <w:tcW w:w="554" w:type="dxa"/>
           </w:tcPr>
           <w:p>
             <w:r>
@@ -307,7 +307,7 @@
         </w:tc>
         <w:tc>
           <w:tcPr>
-            <w:tcW w:w="3118" w:type="dxa"/>
+            <w:tcW w:w="2965" w:type="dxa"/>
           </w:tcPr>
           <w:p>
             <w:pPr>
@@ -339,7 +339,7 @@
         </w:tc>
         <w:tc>
           <w:tcPr>
-            <w:tcW w:w="3402" w:type="dxa"/>
+            <w:tcW w:w="3224" w:type="dxa"/>
           </w:tcPr>
           <w:p>
             <w:r>
@@ -349,7 +349,7 @@
         </w:tc>
         <w:tc>
           <w:tcPr>
-            <w:tcW w:w="1701" w:type="dxa"/>
+            <w:tcW w:w="1629" w:type="dxa"/>
           </w:tcPr>
           <w:p>
             <w:r>
@@ -359,7 +359,7 @@
         </w:tc>
         <w:tc>
           <w:tcPr>
-            <w:tcW w:w="4535" w:type="dxa"/>
+            <w:tcW w:w="4289" w:type="dxa"/>
           </w:tcPr>
           <w:p>
             <w:r>
@@ -391,7 +391,7 @@
         </w:tc>
         <w:tc>
           <w:tcPr>
-            <w:tcW w:w="1134" w:type="dxa"/>
+            <w:tcW w:w="1127" w:type="dxa"/>
           </w:tcPr>
           <w:p>
             <w:r>
@@ -403,7 +403,7 @@
       <w:tr>
         <w:tc>
           <w:tcPr>
-            <w:tcW w:w="567" w:type="dxa"/>
+            <w:tcW w:w="554" w:type="dxa"/>
           </w:tcPr>
           <w:p>
             <w:r>
@@ -413,7 +413,7 @@
         </w:tc>
         <w:tc>
           <w:tcPr>
-            <w:tcW w:w="3118" w:type="dxa"/>
+            <w:tcW w:w="2965" w:type="dxa"/>
           </w:tcPr>
           <w:p>
             <w:pPr>
@@ -431,7 +431,7 @@
         </w:tc>
         <w:tc>
           <w:tcPr>
-            <w:tcW w:w="3402" w:type="dxa"/>
+            <w:tcW w:w="3224" w:type="dxa"/>
           </w:tcPr>
           <w:p>
             <w:pPr>
@@ -463,7 +463,7 @@
         </w:tc>
         <w:tc>
           <w:tcPr>
-            <w:tcW w:w="1701" w:type="dxa"/>
+            <w:tcW w:w="1629" w:type="dxa"/>
           </w:tcPr>
           <w:p>
             <w:r>
@@ -473,7 +473,7 @@
         </w:tc>
         <w:tc>
           <w:tcPr>
-            <w:tcW w:w="4535" w:type="dxa"/>
+            <w:tcW w:w="4289" w:type="dxa"/>
           </w:tcPr>
           <w:p>
             <w:pPr>
@@ -485,7 +485,19 @@
               <w:rPr>
                 <w:lang w:val="es-CO"/>
               </w:rPr>
-              <w:t xml:space="preserve">Herramienta creada con id 3. Queda guardada en </w:t>
+              <w:t xml:space="preserve">Herramienta creada con </w:t>
+            </w:r>
+            <w:r>
+              <w:rPr>
+                <w:lang w:val="es-CO"/>
+              </w:rPr>
+              <w:t>el ultimo id</w:t>
+            </w:r>
+            <w:r>
+              <w:rPr>
+                <w:lang w:val="es-CO"/>
+              </w:rPr>
+              <w:t xml:space="preserve">. Queda guardada en </w:t>
             </w:r>
             <w:proofErr w:type="spellStart"/>
             <w:proofErr w:type="gramStart"/>
@@ -507,7 +519,7 @@
         </w:tc>
         <w:tc>
           <w:tcPr>
-            <w:tcW w:w="1134" w:type="dxa"/>
+            <w:tcW w:w="1127" w:type="dxa"/>
           </w:tcPr>
           <w:p>
             <w:r>
@@ -519,7 +531,7 @@
       <w:tr>
         <w:tc>
           <w:tcPr>
-            <w:tcW w:w="567" w:type="dxa"/>
+            <w:tcW w:w="554" w:type="dxa"/>
           </w:tcPr>
           <w:p>
             <w:r>
@@ -529,7 +541,7 @@
         </w:tc>
         <w:tc>
           <w:tcPr>
-            <w:tcW w:w="3118" w:type="dxa"/>
+            <w:tcW w:w="2965" w:type="dxa"/>
           </w:tcPr>
           <w:p>
             <w:pPr>
@@ -547,7 +559,7 @@
         </w:tc>
         <w:tc>
           <w:tcPr>
-            <w:tcW w:w="3402" w:type="dxa"/>
+            <w:tcW w:w="3224" w:type="dxa"/>
           </w:tcPr>
           <w:p>
             <w:proofErr w:type="spellStart"/>
@@ -562,7 +574,7 @@
         </w:tc>
         <w:tc>
           <w:tcPr>
-            <w:tcW w:w="1701" w:type="dxa"/>
+            <w:tcW w:w="1629" w:type="dxa"/>
           </w:tcPr>
           <w:p>
             <w:r>
@@ -572,7 +584,7 @@
         </w:tc>
         <w:tc>
           <w:tcPr>
-            <w:tcW w:w="4535" w:type="dxa"/>
+            <w:tcW w:w="4289" w:type="dxa"/>
           </w:tcPr>
           <w:p>
             <w:r>
@@ -581,22 +593,19 @@
               </w:rPr>
               <w:t xml:space="preserve">El numero debe ser mayor o igual a 0. </w:t>
             </w:r>
-            <w:r>
-              <w:t xml:space="preserve">Vuelve a </w:t>
-            </w:r>
             <w:proofErr w:type="spellStart"/>
             <w:r>
-              <w:t>preguntar</w:t>
+              <w:t>Intente</w:t>
             </w:r>
             <w:proofErr w:type="spellEnd"/>
             <w:r>
-              <w:t>.</w:t>
-            </w:r>
-          </w:p>
-        </w:tc>
-        <w:tc>
-          <w:tcPr>
-            <w:tcW w:w="1134" w:type="dxa"/>
+              <w:t xml:space="preserve"> de nuevo.</w:t>
+            </w:r>
+          </w:p>
+        </w:tc>
+        <w:tc>
+          <w:tcPr>
+            <w:tcW w:w="1127" w:type="dxa"/>
           </w:tcPr>
           <w:p>
             <w:r>
@@ -608,7 +617,7 @@
       <w:tr>
         <w:tc>
           <w:tcPr>
-            <w:tcW w:w="567" w:type="dxa"/>
+            <w:tcW w:w="554" w:type="dxa"/>
           </w:tcPr>
           <w:p>
             <w:r>
@@ -618,7 +627,7 @@
         </w:tc>
         <w:tc>
           <w:tcPr>
-            <w:tcW w:w="3118" w:type="dxa"/>
+            <w:tcW w:w="2965" w:type="dxa"/>
           </w:tcPr>
           <w:p>
             <w:pPr>
@@ -636,7 +645,7 @@
         </w:tc>
         <w:tc>
           <w:tcPr>
-            <w:tcW w:w="3402" w:type="dxa"/>
+            <w:tcW w:w="3224" w:type="dxa"/>
           </w:tcPr>
           <w:p>
             <w:proofErr w:type="spellStart"/>
@@ -656,7 +665,7 @@
         </w:tc>
         <w:tc>
           <w:tcPr>
-            <w:tcW w:w="1701" w:type="dxa"/>
+            <w:tcW w:w="1629" w:type="dxa"/>
           </w:tcPr>
           <w:p>
             <w:r>
@@ -666,31 +675,28 @@
         </w:tc>
         <w:tc>
           <w:tcPr>
-            <w:tcW w:w="4535" w:type="dxa"/>
-          </w:tcPr>
-          <w:p>
-            <w:r>
-              <w:rPr>
-                <w:lang w:val="es-CO"/>
-              </w:rPr>
-              <w:t xml:space="preserve">Debe ingresar un numero entero. </w:t>
-            </w:r>
-            <w:r>
-              <w:t xml:space="preserve">Vuelve a </w:t>
+            <w:tcW w:w="4289" w:type="dxa"/>
+          </w:tcPr>
+          <w:p>
+            <w:r>
+              <w:rPr>
+                <w:lang w:val="es-CO"/>
+              </w:rPr>
+              <w:t xml:space="preserve">El numero debe ser mayor o igual a 0. </w:t>
             </w:r>
             <w:proofErr w:type="spellStart"/>
             <w:r>
-              <w:t>preguntar</w:t>
+              <w:t>Intente</w:t>
             </w:r>
             <w:proofErr w:type="spellEnd"/>
             <w:r>
-              <w:t>.</w:t>
-            </w:r>
-          </w:p>
-        </w:tc>
-        <w:tc>
-          <w:tcPr>
-            <w:tcW w:w="1134" w:type="dxa"/>
+              <w:t xml:space="preserve"> de nuevo.</w:t>
+            </w:r>
+          </w:p>
+        </w:tc>
+        <w:tc>
+          <w:tcPr>
+            <w:tcW w:w="1127" w:type="dxa"/>
           </w:tcPr>
           <w:p>
             <w:r>
@@ -702,7 +708,7 @@
       <w:tr>
         <w:tc>
           <w:tcPr>
-            <w:tcW w:w="567" w:type="dxa"/>
+            <w:tcW w:w="554" w:type="dxa"/>
           </w:tcPr>
           <w:p>
             <w:r>
@@ -712,7 +718,7 @@
         </w:tc>
         <w:tc>
           <w:tcPr>
-            <w:tcW w:w="3118" w:type="dxa"/>
+            <w:tcW w:w="2965" w:type="dxa"/>
           </w:tcPr>
           <w:p>
             <w:pPr>
@@ -738,7 +744,7 @@
         </w:tc>
         <w:tc>
           <w:tcPr>
-            <w:tcW w:w="3402" w:type="dxa"/>
+            <w:tcW w:w="3224" w:type="dxa"/>
           </w:tcPr>
           <w:p>
             <w:proofErr w:type="spellStart"/>
@@ -761,7 +767,7 @@
         </w:tc>
         <w:tc>
           <w:tcPr>
-            <w:tcW w:w="1701" w:type="dxa"/>
+            <w:tcW w:w="1629" w:type="dxa"/>
           </w:tcPr>
           <w:p>
             <w:r>
@@ -771,7 +777,7 @@
         </w:tc>
         <w:tc>
           <w:tcPr>
-            <w:tcW w:w="4535" w:type="dxa"/>
+            <w:tcW w:w="4289" w:type="dxa"/>
           </w:tcPr>
           <w:p>
             <w:r>
@@ -792,22 +798,19 @@
               </w:rPr>
               <w:t xml:space="preserve">. </w:t>
             </w:r>
-            <w:r>
-              <w:t xml:space="preserve">Vuelve a </w:t>
-            </w:r>
             <w:proofErr w:type="spellStart"/>
             <w:r>
-              <w:t>preguntar</w:t>
+              <w:t>Intente</w:t>
             </w:r>
             <w:proofErr w:type="spellEnd"/>
             <w:r>
-              <w:t>.</w:t>
-            </w:r>
-          </w:p>
-        </w:tc>
-        <w:tc>
-          <w:tcPr>
-            <w:tcW w:w="1134" w:type="dxa"/>
+              <w:t xml:space="preserve"> de nuevo.</w:t>
+            </w:r>
+          </w:p>
+        </w:tc>
+        <w:tc>
+          <w:tcPr>
+            <w:tcW w:w="1127" w:type="dxa"/>
           </w:tcPr>
           <w:p>
             <w:r>
@@ -819,7 +822,7 @@
       <w:tr>
         <w:tc>
           <w:tcPr>
-            <w:tcW w:w="567" w:type="dxa"/>
+            <w:tcW w:w="554" w:type="dxa"/>
           </w:tcPr>
           <w:p>
             <w:r>
@@ -829,7 +832,7 @@
         </w:tc>
         <w:tc>
           <w:tcPr>
-            <w:tcW w:w="3118" w:type="dxa"/>
+            <w:tcW w:w="2965" w:type="dxa"/>
           </w:tcPr>
           <w:p>
             <w:pPr>
@@ -861,7 +864,7 @@
         </w:tc>
         <w:tc>
           <w:tcPr>
-            <w:tcW w:w="3402" w:type="dxa"/>
+            <w:tcW w:w="3224" w:type="dxa"/>
           </w:tcPr>
           <w:p>
             <w:proofErr w:type="spellStart"/>
@@ -876,7 +879,7 @@
         </w:tc>
         <w:tc>
           <w:tcPr>
-            <w:tcW w:w="1701" w:type="dxa"/>
+            <w:tcW w:w="1629" w:type="dxa"/>
           </w:tcPr>
           <w:p>
             <w:r>
@@ -886,7 +889,7 @@
         </w:tc>
         <w:tc>
           <w:tcPr>
-            <w:tcW w:w="4535" w:type="dxa"/>
+            <w:tcW w:w="4289" w:type="dxa"/>
           </w:tcPr>
           <w:p>
             <w:pPr>
@@ -910,13 +913,13 @@
               <w:rPr>
                 <w:lang w:val="es-CO"/>
               </w:rPr>
-              <w:t xml:space="preserve"> no existe. Vuelve a preguntar.</w:t>
-            </w:r>
-          </w:p>
-        </w:tc>
-        <w:tc>
-          <w:tcPr>
-            <w:tcW w:w="1134" w:type="dxa"/>
+              <w:t xml:space="preserve"> no existe.</w:t>
+            </w:r>
+          </w:p>
+        </w:tc>
+        <w:tc>
+          <w:tcPr>
+            <w:tcW w:w="1127" w:type="dxa"/>
           </w:tcPr>
           <w:p>
             <w:r>
@@ -928,7 +931,7 @@
       <w:tr>
         <w:tc>
           <w:tcPr>
-            <w:tcW w:w="567" w:type="dxa"/>
+            <w:tcW w:w="554" w:type="dxa"/>
           </w:tcPr>
           <w:p>
             <w:r>
@@ -938,7 +941,7 @@
         </w:tc>
         <w:tc>
           <w:tcPr>
-            <w:tcW w:w="3118" w:type="dxa"/>
+            <w:tcW w:w="2965" w:type="dxa"/>
           </w:tcPr>
           <w:p>
             <w:pPr>
@@ -956,7 +959,7 @@
         </w:tc>
         <w:tc>
           <w:tcPr>
-            <w:tcW w:w="3402" w:type="dxa"/>
+            <w:tcW w:w="3224" w:type="dxa"/>
           </w:tcPr>
           <w:p>
             <w:proofErr w:type="spellStart"/>
@@ -976,7 +979,7 @@
         </w:tc>
         <w:tc>
           <w:tcPr>
-            <w:tcW w:w="1701" w:type="dxa"/>
+            <w:tcW w:w="1629" w:type="dxa"/>
           </w:tcPr>
           <w:p>
             <w:r>
@@ -986,7 +989,7 @@
         </w:tc>
         <w:tc>
           <w:tcPr>
-            <w:tcW w:w="4535" w:type="dxa"/>
+            <w:tcW w:w="4289" w:type="dxa"/>
           </w:tcPr>
           <w:p>
             <w:pPr>
@@ -1000,14 +1003,12 @@
               </w:rPr>
               <w:t xml:space="preserve">Lista la herramienta Taladro. No distingue </w:t>
             </w:r>
-            <w:proofErr w:type="spellStart"/>
-            <w:r>
-              <w:rPr>
-                <w:lang w:val="es-CO"/>
-              </w:rPr>
-              <w:t>mayusculas</w:t>
-            </w:r>
-            <w:proofErr w:type="spellEnd"/>
+            <w:r>
+              <w:rPr>
+                <w:lang w:val="es-CO"/>
+              </w:rPr>
+              <w:t>mayúsculas</w:t>
+            </w:r>
             <w:r>
               <w:rPr>
                 <w:lang w:val="es-CO"/>
@@ -1018,7 +1019,7 @@
         </w:tc>
         <w:tc>
           <w:tcPr>
-            <w:tcW w:w="1134" w:type="dxa"/>
+            <w:tcW w:w="1127" w:type="dxa"/>
           </w:tcPr>
           <w:p>
             <w:r>
@@ -1030,7 +1031,7 @@
       <w:tr>
         <w:tc>
           <w:tcPr>
-            <w:tcW w:w="567" w:type="dxa"/>
+            <w:tcW w:w="554" w:type="dxa"/>
           </w:tcPr>
           <w:p>
             <w:r>
@@ -1040,7 +1041,7 @@
         </w:tc>
         <w:tc>
           <w:tcPr>
-            <w:tcW w:w="3118" w:type="dxa"/>
+            <w:tcW w:w="2965" w:type="dxa"/>
           </w:tcPr>
           <w:p>
             <w:pPr>
@@ -1058,7 +1059,7 @@
         </w:tc>
         <w:tc>
           <w:tcPr>
-            <w:tcW w:w="3402" w:type="dxa"/>
+            <w:tcW w:w="3224" w:type="dxa"/>
           </w:tcPr>
           <w:p>
             <w:proofErr w:type="spellStart"/>
@@ -1073,7 +1074,7 @@
         </w:tc>
         <w:tc>
           <w:tcPr>
-            <w:tcW w:w="1701" w:type="dxa"/>
+            <w:tcW w:w="1629" w:type="dxa"/>
           </w:tcPr>
           <w:p>
             <w:r>
@@ -1083,7 +1084,7 @@
         </w:tc>
         <w:tc>
           <w:tcPr>
-            <w:tcW w:w="4535" w:type="dxa"/>
+            <w:tcW w:w="4289" w:type="dxa"/>
           </w:tcPr>
           <w:p>
             <w:pPr>
@@ -1097,14 +1098,12 @@
               </w:rPr>
               <w:t xml:space="preserve">No se </w:t>
             </w:r>
-            <w:proofErr w:type="spellStart"/>
-            <w:r>
-              <w:rPr>
-                <w:lang w:val="es-CO"/>
-              </w:rPr>
-              <w:t>encontro</w:t>
-            </w:r>
-            <w:proofErr w:type="spellEnd"/>
+            <w:r>
+              <w:rPr>
+                <w:lang w:val="es-CO"/>
+              </w:rPr>
+              <w:t>encontró</w:t>
+            </w:r>
             <w:r>
               <w:rPr>
                 <w:lang w:val="es-CO"/>
@@ -1115,7 +1114,7 @@
         </w:tc>
         <w:tc>
           <w:tcPr>
-            <w:tcW w:w="1134" w:type="dxa"/>
+            <w:tcW w:w="1127" w:type="dxa"/>
           </w:tcPr>
           <w:p>
             <w:r>
@@ -1127,7 +1126,7 @@
       <w:tr>
         <w:tc>
           <w:tcPr>
-            <w:tcW w:w="567" w:type="dxa"/>
+            <w:tcW w:w="554" w:type="dxa"/>
           </w:tcPr>
           <w:p>
             <w:r>
@@ -1137,7 +1136,7 @@
         </w:tc>
         <w:tc>
           <w:tcPr>
-            <w:tcW w:w="3118" w:type="dxa"/>
+            <w:tcW w:w="2965" w:type="dxa"/>
           </w:tcPr>
           <w:p>
             <w:pPr>
@@ -1155,7 +1154,7 @@
         </w:tc>
         <w:tc>
           <w:tcPr>
-            <w:tcW w:w="3402" w:type="dxa"/>
+            <w:tcW w:w="3224" w:type="dxa"/>
           </w:tcPr>
           <w:p>
             <w:r>
@@ -1165,7 +1164,7 @@
         </w:tc>
         <w:tc>
           <w:tcPr>
-            <w:tcW w:w="1701" w:type="dxa"/>
+            <w:tcW w:w="1629" w:type="dxa"/>
           </w:tcPr>
           <w:p>
             <w:r>
@@ -1175,7 +1174,7 @@
         </w:tc>
         <w:tc>
           <w:tcPr>
-            <w:tcW w:w="4535" w:type="dxa"/>
+            <w:tcW w:w="4289" w:type="dxa"/>
           </w:tcPr>
           <w:p>
             <w:r>
@@ -1199,7 +1198,7 @@
         </w:tc>
         <w:tc>
           <w:tcPr>
-            <w:tcW w:w="1134" w:type="dxa"/>
+            <w:tcW w:w="1127" w:type="dxa"/>
           </w:tcPr>
           <w:p>
             <w:r>
@@ -1211,7 +1210,7 @@
       <w:tr>
         <w:tc>
           <w:tcPr>
-            <w:tcW w:w="567" w:type="dxa"/>
+            <w:tcW w:w="554" w:type="dxa"/>
           </w:tcPr>
           <w:p>
             <w:r>
@@ -1221,7 +1220,7 @@
         </w:tc>
         <w:tc>
           <w:tcPr>
-            <w:tcW w:w="3118" w:type="dxa"/>
+            <w:tcW w:w="2965" w:type="dxa"/>
           </w:tcPr>
           <w:p>
             <w:r>
@@ -1231,7 +1230,7 @@
         </w:tc>
         <w:tc>
           <w:tcPr>
-            <w:tcW w:w="3402" w:type="dxa"/>
+            <w:tcW w:w="3224" w:type="dxa"/>
           </w:tcPr>
           <w:p>
             <w:r>
@@ -1241,7 +1240,7 @@
         </w:tc>
         <w:tc>
           <w:tcPr>
-            <w:tcW w:w="1701" w:type="dxa"/>
+            <w:tcW w:w="1629" w:type="dxa"/>
           </w:tcPr>
           <w:p>
             <w:r>
@@ -1251,7 +1250,7 @@
         </w:tc>
         <w:tc>
           <w:tcPr>
-            <w:tcW w:w="4535" w:type="dxa"/>
+            <w:tcW w:w="4289" w:type="dxa"/>
           </w:tcPr>
           <w:p>
             <w:pPr>
@@ -1269,7 +1268,7 @@
         </w:tc>
         <w:tc>
           <w:tcPr>
-            <w:tcW w:w="1134" w:type="dxa"/>
+            <w:tcW w:w="1127" w:type="dxa"/>
           </w:tcPr>
           <w:p>
             <w:r>
@@ -1281,7 +1280,7 @@
       <w:tr>
         <w:tc>
           <w:tcPr>
-            <w:tcW w:w="567" w:type="dxa"/>
+            <w:tcW w:w="554" w:type="dxa"/>
           </w:tcPr>
           <w:p>
             <w:r>
@@ -1291,7 +1290,7 @@
         </w:tc>
         <w:tc>
           <w:tcPr>
-            <w:tcW w:w="3118" w:type="dxa"/>
+            <w:tcW w:w="2965" w:type="dxa"/>
           </w:tcPr>
           <w:p>
             <w:pPr>
@@ -1317,7 +1316,7 @@
         </w:tc>
         <w:tc>
           <w:tcPr>
-            <w:tcW w:w="3402" w:type="dxa"/>
+            <w:tcW w:w="3224" w:type="dxa"/>
           </w:tcPr>
           <w:p>
             <w:r>
@@ -1343,7 +1342,7 @@
         </w:tc>
         <w:tc>
           <w:tcPr>
-            <w:tcW w:w="1701" w:type="dxa"/>
+            <w:tcW w:w="1629" w:type="dxa"/>
           </w:tcPr>
           <w:p>
             <w:r>
@@ -1353,7 +1352,7 @@
         </w:tc>
         <w:tc>
           <w:tcPr>
-            <w:tcW w:w="4535" w:type="dxa"/>
+            <w:tcW w:w="4289" w:type="dxa"/>
           </w:tcPr>
           <w:p>
             <w:pPr>
@@ -1379,7 +1378,7 @@
         </w:tc>
         <w:tc>
           <w:tcPr>
-            <w:tcW w:w="1134" w:type="dxa"/>
+            <w:tcW w:w="1127" w:type="dxa"/>
           </w:tcPr>
           <w:p>
             <w:r>
@@ -1391,7 +1390,7 @@
       <w:tr>
         <w:tc>
           <w:tcPr>
-            <w:tcW w:w="567" w:type="dxa"/>
+            <w:tcW w:w="554" w:type="dxa"/>
           </w:tcPr>
           <w:p>
             <w:r>
@@ -1401,7 +1400,7 @@
         </w:tc>
         <w:tc>
           <w:tcPr>
-            <w:tcW w:w="3118" w:type="dxa"/>
+            <w:tcW w:w="2965" w:type="dxa"/>
           </w:tcPr>
           <w:p>
             <w:pPr>
@@ -1447,7 +1446,7 @@
         </w:tc>
         <w:tc>
           <w:tcPr>
-            <w:tcW w:w="3402" w:type="dxa"/>
+            <w:tcW w:w="3224" w:type="dxa"/>
           </w:tcPr>
           <w:p>
             <w:proofErr w:type="spellStart"/>
@@ -1462,7 +1461,7 @@
         </w:tc>
         <w:tc>
           <w:tcPr>
-            <w:tcW w:w="1701" w:type="dxa"/>
+            <w:tcW w:w="1629" w:type="dxa"/>
           </w:tcPr>
           <w:p>
             <w:r>
@@ -1472,7 +1471,7 @@
         </w:tc>
         <w:tc>
           <w:tcPr>
-            <w:tcW w:w="4535" w:type="dxa"/>
+            <w:tcW w:w="4289" w:type="dxa"/>
           </w:tcPr>
           <w:p>
             <w:pPr>
@@ -1504,7 +1503,7 @@
         </w:tc>
         <w:tc>
           <w:tcPr>
-            <w:tcW w:w="1134" w:type="dxa"/>
+            <w:tcW w:w="1127" w:type="dxa"/>
           </w:tcPr>
           <w:p>
             <w:r>
@@ -1516,7 +1515,7 @@
       <w:tr>
         <w:tc>
           <w:tcPr>
-            <w:tcW w:w="567" w:type="dxa"/>
+            <w:tcW w:w="554" w:type="dxa"/>
           </w:tcPr>
           <w:p>
             <w:r>
@@ -1526,7 +1525,7 @@
         </w:tc>
         <w:tc>
           <w:tcPr>
-            <w:tcW w:w="3118" w:type="dxa"/>
+            <w:tcW w:w="2965" w:type="dxa"/>
           </w:tcPr>
           <w:p>
             <w:pPr>
@@ -1551,7 +1550,7 @@
         </w:tc>
         <w:tc>
           <w:tcPr>
-            <w:tcW w:w="3402" w:type="dxa"/>
+            <w:tcW w:w="3224" w:type="dxa"/>
           </w:tcPr>
           <w:p>
             <w:pPr>
@@ -1623,7 +1622,7 @@
         </w:tc>
         <w:tc>
           <w:tcPr>
-            <w:tcW w:w="1701" w:type="dxa"/>
+            <w:tcW w:w="1629" w:type="dxa"/>
           </w:tcPr>
           <w:p>
             <w:r>
@@ -1638,7 +1637,7 @@
         </w:tc>
         <w:tc>
           <w:tcPr>
-            <w:tcW w:w="4535" w:type="dxa"/>
+            <w:tcW w:w="4289" w:type="dxa"/>
           </w:tcPr>
           <w:p>
             <w:pPr>
@@ -1651,7 +1650,26 @@
                 <w:lang w:val="es-CO"/>
               </w:rPr>
               <w:lastRenderedPageBreak/>
-              <w:t xml:space="preserve">Usuario creado con id 4. Queda guardado en </w:t>
+              <w:t xml:space="preserve">Usuario creado con id </w:t>
+            </w:r>
+            <w:r>
+              <w:rPr>
+                <w:lang w:val="es-CO"/>
+              </w:rPr>
+              <w:t>(Ultimo id)</w:t>
+            </w:r>
+            <w:r>
+              <w:rPr>
+                <w:lang w:val="es-CO"/>
+              </w:rPr>
+              <w:t xml:space="preserve">. Queda </w:t>
+            </w:r>
+            <w:r>
+              <w:rPr>
+                <w:lang w:val="es-CO"/>
+              </w:rPr>
+              <w:lastRenderedPageBreak/>
+              <w:t xml:space="preserve">guardado en </w:t>
             </w:r>
             <w:proofErr w:type="spellStart"/>
             <w:proofErr w:type="gramStart"/>
@@ -1659,7 +1677,6 @@
               <w:rPr>
                 <w:lang w:val="es-CO"/>
               </w:rPr>
-              <w:lastRenderedPageBreak/>
               <w:t>usuarios.json</w:t>
             </w:r>
             <w:proofErr w:type="spellEnd"/>
@@ -1674,7 +1691,7 @@
         </w:tc>
         <w:tc>
           <w:tcPr>
-            <w:tcW w:w="1134" w:type="dxa"/>
+            <w:tcW w:w="1127" w:type="dxa"/>
           </w:tcPr>
           <w:p>
             <w:r>
@@ -1687,7 +1704,7 @@
       <w:tr>
         <w:tc>
           <w:tcPr>
-            <w:tcW w:w="567" w:type="dxa"/>
+            <w:tcW w:w="554" w:type="dxa"/>
           </w:tcPr>
           <w:p>
             <w:r>
@@ -1697,7 +1714,7 @@
         </w:tc>
         <w:tc>
           <w:tcPr>
-            <w:tcW w:w="3118" w:type="dxa"/>
+            <w:tcW w:w="2965" w:type="dxa"/>
           </w:tcPr>
           <w:p>
             <w:pPr>
@@ -1723,7 +1740,7 @@
         </w:tc>
         <w:tc>
           <w:tcPr>
-            <w:tcW w:w="3402" w:type="dxa"/>
+            <w:tcW w:w="3224" w:type="dxa"/>
           </w:tcPr>
           <w:p>
             <w:proofErr w:type="spellStart"/>
@@ -1738,7 +1755,7 @@
         </w:tc>
         <w:tc>
           <w:tcPr>
-            <w:tcW w:w="1701" w:type="dxa"/>
+            <w:tcW w:w="1629" w:type="dxa"/>
           </w:tcPr>
           <w:p>
             <w:r>
@@ -1748,7 +1765,7 @@
         </w:tc>
         <w:tc>
           <w:tcPr>
-            <w:tcW w:w="4535" w:type="dxa"/>
+            <w:tcW w:w="4289" w:type="dxa"/>
           </w:tcPr>
           <w:p>
             <w:pPr>
@@ -1766,7 +1783,7 @@
         </w:tc>
         <w:tc>
           <w:tcPr>
-            <w:tcW w:w="1134" w:type="dxa"/>
+            <w:tcW w:w="1127" w:type="dxa"/>
           </w:tcPr>
           <w:p>
             <w:r>
@@ -1778,7 +1795,7 @@
       <w:tr>
         <w:tc>
           <w:tcPr>
-            <w:tcW w:w="567" w:type="dxa"/>
+            <w:tcW w:w="554" w:type="dxa"/>
           </w:tcPr>
           <w:p>
             <w:r>
@@ -1788,7 +1805,7 @@
         </w:tc>
         <w:tc>
           <w:tcPr>
-            <w:tcW w:w="3118" w:type="dxa"/>
+            <w:tcW w:w="2965" w:type="dxa"/>
           </w:tcPr>
           <w:p>
             <w:pPr>
@@ -1814,7 +1831,7 @@
         </w:tc>
         <w:tc>
           <w:tcPr>
-            <w:tcW w:w="3402" w:type="dxa"/>
+            <w:tcW w:w="3224" w:type="dxa"/>
           </w:tcPr>
           <w:p>
             <w:r>
@@ -1832,7 +1849,7 @@
         </w:tc>
         <w:tc>
           <w:tcPr>
-            <w:tcW w:w="1701" w:type="dxa"/>
+            <w:tcW w:w="1629" w:type="dxa"/>
           </w:tcPr>
           <w:p>
             <w:r>
@@ -1842,7 +1859,7 @@
         </w:tc>
         <w:tc>
           <w:tcPr>
-            <w:tcW w:w="4535" w:type="dxa"/>
+            <w:tcW w:w="4289" w:type="dxa"/>
           </w:tcPr>
           <w:p>
             <w:pPr>
@@ -1868,7 +1885,7 @@
         </w:tc>
         <w:tc>
           <w:tcPr>
-            <w:tcW w:w="1134" w:type="dxa"/>
+            <w:tcW w:w="1127" w:type="dxa"/>
           </w:tcPr>
           <w:p>
             <w:r>
@@ -1880,7 +1897,7 @@
       <w:tr>
         <w:tc>
           <w:tcPr>
-            <w:tcW w:w="567" w:type="dxa"/>
+            <w:tcW w:w="554" w:type="dxa"/>
           </w:tcPr>
           <w:p>
             <w:r>
@@ -1890,7 +1907,7 @@
         </w:tc>
         <w:tc>
           <w:tcPr>
-            <w:tcW w:w="3118" w:type="dxa"/>
+            <w:tcW w:w="2965" w:type="dxa"/>
           </w:tcPr>
           <w:p>
             <w:pPr>
@@ -1922,7 +1939,7 @@
         </w:tc>
         <w:tc>
           <w:tcPr>
-            <w:tcW w:w="3402" w:type="dxa"/>
+            <w:tcW w:w="3224" w:type="dxa"/>
           </w:tcPr>
           <w:p>
             <w:pPr>
@@ -1940,7 +1957,7 @@
         </w:tc>
         <w:tc>
           <w:tcPr>
-            <w:tcW w:w="1701" w:type="dxa"/>
+            <w:tcW w:w="1629" w:type="dxa"/>
           </w:tcPr>
           <w:p>
             <w:r>
@@ -1950,7 +1967,7 @@
         </w:tc>
         <w:tc>
           <w:tcPr>
-            <w:tcW w:w="4535" w:type="dxa"/>
+            <w:tcW w:w="4289" w:type="dxa"/>
           </w:tcPr>
           <w:p>
             <w:pPr>
@@ -2004,7 +2021,7 @@
         </w:tc>
         <w:tc>
           <w:tcPr>
-            <w:tcW w:w="1134" w:type="dxa"/>
+            <w:tcW w:w="1127" w:type="dxa"/>
           </w:tcPr>
           <w:p>
             <w:r>
@@ -2016,7 +2033,7 @@
       <w:tr>
         <w:tc>
           <w:tcPr>
-            <w:tcW w:w="567" w:type="dxa"/>
+            <w:tcW w:w="554" w:type="dxa"/>
           </w:tcPr>
           <w:p>
             <w:r>
@@ -2026,7 +2043,7 @@
         </w:tc>
         <w:tc>
           <w:tcPr>
-            <w:tcW w:w="3118" w:type="dxa"/>
+            <w:tcW w:w="2965" w:type="dxa"/>
           </w:tcPr>
           <w:p>
             <w:pPr>
@@ -2072,7 +2089,7 @@
         </w:tc>
         <w:tc>
           <w:tcPr>
-            <w:tcW w:w="3402" w:type="dxa"/>
+            <w:tcW w:w="3224" w:type="dxa"/>
           </w:tcPr>
           <w:p>
             <w:proofErr w:type="spellStart"/>
@@ -2087,7 +2104,7 @@
         </w:tc>
         <w:tc>
           <w:tcPr>
-            <w:tcW w:w="1701" w:type="dxa"/>
+            <w:tcW w:w="1629" w:type="dxa"/>
           </w:tcPr>
           <w:p>
             <w:r>
@@ -2097,7 +2114,7 @@
         </w:tc>
         <w:tc>
           <w:tcPr>
-            <w:tcW w:w="4535" w:type="dxa"/>
+            <w:tcW w:w="4289" w:type="dxa"/>
           </w:tcPr>
           <w:p>
             <w:pPr>
@@ -2129,7 +2146,7 @@
         </w:tc>
         <w:tc>
           <w:tcPr>
-            <w:tcW w:w="1134" w:type="dxa"/>
+            <w:tcW w:w="1127" w:type="dxa"/>
           </w:tcPr>
           <w:p>
             <w:r>
@@ -2141,7 +2158,7 @@
       <w:tr>
         <w:tc>
           <w:tcPr>
-            <w:tcW w:w="567" w:type="dxa"/>
+            <w:tcW w:w="554" w:type="dxa"/>
           </w:tcPr>
           <w:p>
             <w:r>
@@ -2151,7 +2168,7 @@
         </w:tc>
         <w:tc>
           <w:tcPr>
-            <w:tcW w:w="3118" w:type="dxa"/>
+            <w:tcW w:w="2965" w:type="dxa"/>
           </w:tcPr>
           <w:p>
             <w:pPr>
@@ -2191,7 +2208,7 @@
         </w:tc>
         <w:tc>
           <w:tcPr>
-            <w:tcW w:w="3402" w:type="dxa"/>
+            <w:tcW w:w="3224" w:type="dxa"/>
           </w:tcPr>
           <w:p>
             <w:proofErr w:type="spellStart"/>
@@ -2214,7 +2231,7 @@
         </w:tc>
         <w:tc>
           <w:tcPr>
-            <w:tcW w:w="1701" w:type="dxa"/>
+            <w:tcW w:w="1629" w:type="dxa"/>
           </w:tcPr>
           <w:p>
             <w:r>
@@ -2224,7 +2241,7 @@
         </w:tc>
         <w:tc>
           <w:tcPr>
-            <w:tcW w:w="4535" w:type="dxa"/>
+            <w:tcW w:w="4289" w:type="dxa"/>
           </w:tcPr>
           <w:p>
             <w:pPr>
@@ -2270,7 +2287,7 @@
         </w:tc>
         <w:tc>
           <w:tcPr>
-            <w:tcW w:w="1134" w:type="dxa"/>
+            <w:tcW w:w="1127" w:type="dxa"/>
           </w:tcPr>
           <w:p>
             <w:r>
@@ -2282,7 +2299,7 @@
       <w:tr>
         <w:tc>
           <w:tcPr>
-            <w:tcW w:w="567" w:type="dxa"/>
+            <w:tcW w:w="554" w:type="dxa"/>
           </w:tcPr>
           <w:p>
             <w:r>
@@ -2292,7 +2309,7 @@
         </w:tc>
         <w:tc>
           <w:tcPr>
-            <w:tcW w:w="3118" w:type="dxa"/>
+            <w:tcW w:w="2965" w:type="dxa"/>
           </w:tcPr>
           <w:p>
             <w:pPr>
@@ -2324,7 +2341,7 @@
         </w:tc>
         <w:tc>
           <w:tcPr>
-            <w:tcW w:w="3402" w:type="dxa"/>
+            <w:tcW w:w="3224" w:type="dxa"/>
           </w:tcPr>
           <w:p>
             <w:proofErr w:type="spellStart"/>
@@ -2339,7 +2356,7 @@
         </w:tc>
         <w:tc>
           <w:tcPr>
-            <w:tcW w:w="1701" w:type="dxa"/>
+            <w:tcW w:w="1629" w:type="dxa"/>
           </w:tcPr>
           <w:p>
             <w:r>
@@ -2349,7 +2366,7 @@
         </w:tc>
         <w:tc>
           <w:tcPr>
-            <w:tcW w:w="4535" w:type="dxa"/>
+            <w:tcW w:w="4289" w:type="dxa"/>
           </w:tcPr>
           <w:p>
             <w:pPr>
@@ -2381,7 +2398,7 @@
         </w:tc>
         <w:tc>
           <w:tcPr>
-            <w:tcW w:w="1134" w:type="dxa"/>
+            <w:tcW w:w="1127" w:type="dxa"/>
           </w:tcPr>
           <w:p>
             <w:r>
@@ -2393,7 +2410,7 @@
       <w:tr>
         <w:tc>
           <w:tcPr>
-            <w:tcW w:w="567" w:type="dxa"/>
+            <w:tcW w:w="554" w:type="dxa"/>
           </w:tcPr>
           <w:p>
             <w:r>
@@ -2403,7 +2420,7 @@
         </w:tc>
         <w:tc>
           <w:tcPr>
-            <w:tcW w:w="3118" w:type="dxa"/>
+            <w:tcW w:w="2965" w:type="dxa"/>
           </w:tcPr>
           <w:p>
             <w:r>
@@ -2413,7 +2430,7 @@
         </w:tc>
         <w:tc>
           <w:tcPr>
-            <w:tcW w:w="3402" w:type="dxa"/>
+            <w:tcW w:w="3224" w:type="dxa"/>
           </w:tcPr>
           <w:p>
             <w:r>
@@ -2423,7 +2440,7 @@
         </w:tc>
         <w:tc>
           <w:tcPr>
-            <w:tcW w:w="1701" w:type="dxa"/>
+            <w:tcW w:w="1629" w:type="dxa"/>
           </w:tcPr>
           <w:p>
             <w:r>
@@ -2433,7 +2450,7 @@
         </w:tc>
         <w:tc>
           <w:tcPr>
-            <w:tcW w:w="4535" w:type="dxa"/>
+            <w:tcW w:w="4289" w:type="dxa"/>
           </w:tcPr>
           <w:p>
             <w:pPr>
@@ -2459,7 +2476,7 @@
         </w:tc>
         <w:tc>
           <w:tcPr>
-            <w:tcW w:w="1134" w:type="dxa"/>
+            <w:tcW w:w="1127" w:type="dxa"/>
           </w:tcPr>
           <w:p>
             <w:r>
@@ -2471,7 +2488,7 @@
       <w:tr>
         <w:tc>
           <w:tcPr>
-            <w:tcW w:w="567" w:type="dxa"/>
+            <w:tcW w:w="554" w:type="dxa"/>
           </w:tcPr>
           <w:p>
             <w:r>
@@ -2481,7 +2498,7 @@
         </w:tc>
         <w:tc>
           <w:tcPr>
-            <w:tcW w:w="3118" w:type="dxa"/>
+            <w:tcW w:w="2965" w:type="dxa"/>
           </w:tcPr>
           <w:p>
             <w:pPr>
@@ -2513,7 +2530,7 @@
         </w:tc>
         <w:tc>
           <w:tcPr>
-            <w:tcW w:w="3402" w:type="dxa"/>
+            <w:tcW w:w="3224" w:type="dxa"/>
           </w:tcPr>
           <w:p>
             <w:r>
@@ -2531,7 +2548,7 @@
         </w:tc>
         <w:tc>
           <w:tcPr>
-            <w:tcW w:w="1701" w:type="dxa"/>
+            <w:tcW w:w="1629" w:type="dxa"/>
           </w:tcPr>
           <w:p>
             <w:r>
@@ -2541,7 +2558,7 @@
         </w:tc>
         <w:tc>
           <w:tcPr>
-            <w:tcW w:w="4535" w:type="dxa"/>
+            <w:tcW w:w="4289" w:type="dxa"/>
           </w:tcPr>
           <w:p>
             <w:pPr>
@@ -2573,7 +2590,7 @@
         </w:tc>
         <w:tc>
           <w:tcPr>
-            <w:tcW w:w="1134" w:type="dxa"/>
+            <w:tcW w:w="1127" w:type="dxa"/>
           </w:tcPr>
           <w:p>
             <w:r>
@@ -2585,7 +2602,7 @@
       <w:tr>
         <w:tc>
           <w:tcPr>
-            <w:tcW w:w="567" w:type="dxa"/>
+            <w:tcW w:w="554" w:type="dxa"/>
           </w:tcPr>
           <w:p>
             <w:r>
@@ -2595,7 +2612,7 @@
         </w:tc>
         <w:tc>
           <w:tcPr>
-            <w:tcW w:w="3118" w:type="dxa"/>
+            <w:tcW w:w="2965" w:type="dxa"/>
           </w:tcPr>
           <w:p>
             <w:pPr>
@@ -2613,7 +2630,7 @@
         </w:tc>
         <w:tc>
           <w:tcPr>
-            <w:tcW w:w="3402" w:type="dxa"/>
+            <w:tcW w:w="3224" w:type="dxa"/>
           </w:tcPr>
           <w:p>
             <w:proofErr w:type="spellStart"/>
@@ -2636,7 +2653,7 @@
         </w:tc>
         <w:tc>
           <w:tcPr>
-            <w:tcW w:w="1701" w:type="dxa"/>
+            <w:tcW w:w="1629" w:type="dxa"/>
           </w:tcPr>
           <w:p>
             <w:r>
@@ -2646,7 +2663,7 @@
         </w:tc>
         <w:tc>
           <w:tcPr>
-            <w:tcW w:w="4535" w:type="dxa"/>
+            <w:tcW w:w="4289" w:type="dxa"/>
           </w:tcPr>
           <w:p>
             <w:pPr>
@@ -2664,7 +2681,7 @@
         </w:tc>
         <w:tc>
           <w:tcPr>
-            <w:tcW w:w="1134" w:type="dxa"/>
+            <w:tcW w:w="1127" w:type="dxa"/>
           </w:tcPr>
           <w:p>
             <w:r>
@@ -2676,7 +2693,7 @@
       <w:tr>
         <w:tc>
           <w:tcPr>
-            <w:tcW w:w="567" w:type="dxa"/>
+            <w:tcW w:w="554" w:type="dxa"/>
           </w:tcPr>
           <w:p>
             <w:r>
@@ -2686,7 +2703,7 @@
         </w:tc>
         <w:tc>
           <w:tcPr>
-            <w:tcW w:w="3118" w:type="dxa"/>
+            <w:tcW w:w="2965" w:type="dxa"/>
           </w:tcPr>
           <w:p>
             <w:pPr>
@@ -2716,7 +2733,7 @@
         </w:tc>
         <w:tc>
           <w:tcPr>
-            <w:tcW w:w="3402" w:type="dxa"/>
+            <w:tcW w:w="3224" w:type="dxa"/>
           </w:tcPr>
           <w:p>
             <w:proofErr w:type="spellStart"/>
@@ -2739,7 +2756,7 @@
         </w:tc>
         <w:tc>
           <w:tcPr>
-            <w:tcW w:w="1701" w:type="dxa"/>
+            <w:tcW w:w="1629" w:type="dxa"/>
           </w:tcPr>
           <w:p>
             <w:r>
@@ -2749,7 +2766,7 @@
         </w:tc>
         <w:tc>
           <w:tcPr>
-            <w:tcW w:w="4535" w:type="dxa"/>
+            <w:tcW w:w="4289" w:type="dxa"/>
           </w:tcPr>
           <w:p>
             <w:pPr>
@@ -2767,7 +2784,7 @@
         </w:tc>
         <w:tc>
           <w:tcPr>
-            <w:tcW w:w="1134" w:type="dxa"/>
+            <w:tcW w:w="1127" w:type="dxa"/>
           </w:tcPr>
           <w:p>
             <w:r>
@@ -2779,7 +2796,7 @@
       <w:tr>
         <w:tc>
           <w:tcPr>
-            <w:tcW w:w="567" w:type="dxa"/>
+            <w:tcW w:w="554" w:type="dxa"/>
           </w:tcPr>
           <w:p>
             <w:r>
@@ -2789,7 +2806,7 @@
         </w:tc>
         <w:tc>
           <w:tcPr>
-            <w:tcW w:w="3118" w:type="dxa"/>
+            <w:tcW w:w="2965" w:type="dxa"/>
           </w:tcPr>
           <w:p>
             <w:pPr>
@@ -2807,7 +2824,7 @@
         </w:tc>
         <w:tc>
           <w:tcPr>
-            <w:tcW w:w="3402" w:type="dxa"/>
+            <w:tcW w:w="3224" w:type="dxa"/>
           </w:tcPr>
           <w:p>
             <w:r>
@@ -2833,7 +2850,7 @@
         </w:tc>
         <w:tc>
           <w:tcPr>
-            <w:tcW w:w="1701" w:type="dxa"/>
+            <w:tcW w:w="1629" w:type="dxa"/>
           </w:tcPr>
           <w:p>
             <w:r>
@@ -2843,7 +2860,7 @@
         </w:tc>
         <w:tc>
           <w:tcPr>
-            <w:tcW w:w="4535" w:type="dxa"/>
+            <w:tcW w:w="4289" w:type="dxa"/>
           </w:tcPr>
           <w:p>
             <w:pPr>
@@ -2861,7 +2878,7 @@
         </w:tc>
         <w:tc>
           <w:tcPr>
-            <w:tcW w:w="1134" w:type="dxa"/>
+            <w:tcW w:w="1127" w:type="dxa"/>
           </w:tcPr>
           <w:p>
             <w:r>
@@ -2873,7 +2890,7 @@
       <w:tr>
         <w:tc>
           <w:tcPr>
-            <w:tcW w:w="567" w:type="dxa"/>
+            <w:tcW w:w="554" w:type="dxa"/>
           </w:tcPr>
           <w:p>
             <w:r>
@@ -2883,7 +2900,7 @@
         </w:tc>
         <w:tc>
           <w:tcPr>
-            <w:tcW w:w="3118" w:type="dxa"/>
+            <w:tcW w:w="2965" w:type="dxa"/>
           </w:tcPr>
           <w:p>
             <w:pPr>
@@ -2891,45 +2908,41 @@
                 <w:lang w:val="es-CO"/>
               </w:rPr>
             </w:pPr>
-            <w:r>
-              <w:rPr>
-                <w:lang w:val="es-CO"/>
-              </w:rPr>
-              <w:t>Aprobar una solicitud que ya fue aprobada</w:t>
-            </w:r>
-          </w:p>
-        </w:tc>
-        <w:tc>
-          <w:tcPr>
-            <w:tcW w:w="3402" w:type="dxa"/>
-          </w:tcPr>
-          <w:p>
-            <w:r>
-              <w:t xml:space="preserve">id </w:t>
-            </w:r>
             <w:proofErr w:type="spellStart"/>
             <w:r>
-              <w:t>solicitud</w:t>
+              <w:t>Reporte</w:t>
             </w:r>
             <w:proofErr w:type="spellEnd"/>
             <w:r>
-              <w:t xml:space="preserve"> = 2</w:t>
-            </w:r>
-          </w:p>
-        </w:tc>
-        <w:tc>
-          <w:tcPr>
-            <w:tcW w:w="1701" w:type="dxa"/>
-          </w:tcPr>
-          <w:p>
-            <w:r>
-              <w:t>int</w:t>
-            </w:r>
-          </w:p>
-        </w:tc>
-        <w:tc>
-          <w:tcPr>
-            <w:tcW w:w="4535" w:type="dxa"/>
+              <w:t xml:space="preserve"> de stock bajo</w:t>
+            </w:r>
+          </w:p>
+        </w:tc>
+        <w:tc>
+          <w:tcPr>
+            <w:tcW w:w="3224" w:type="dxa"/>
+          </w:tcPr>
+          <w:p>
+            <w:proofErr w:type="spellStart"/>
+            <w:r>
+              <w:t>ninguna</w:t>
+            </w:r>
+            <w:proofErr w:type="spellEnd"/>
+          </w:p>
+        </w:tc>
+        <w:tc>
+          <w:tcPr>
+            <w:tcW w:w="1629" w:type="dxa"/>
+          </w:tcPr>
+          <w:p>
+            <w:r>
+              <w:t>-</w:t>
+            </w:r>
+          </w:p>
+        </w:tc>
+        <w:tc>
+          <w:tcPr>
+            <w:tcW w:w="4289" w:type="dxa"/>
           </w:tcPr>
           <w:p>
             <w:pPr>
@@ -2941,13 +2954,13 @@
               <w:rPr>
                 <w:lang w:val="es-CO"/>
               </w:rPr>
-              <w:t>Esa solicitud ya fue aprobada.</w:t>
-            </w:r>
-          </w:p>
-        </w:tc>
-        <w:tc>
-          <w:tcPr>
-            <w:tcW w:w="1134" w:type="dxa"/>
+              <w:t>Lista las herramientas con menos de 3 unidades.</w:t>
+            </w:r>
+          </w:p>
+        </w:tc>
+        <w:tc>
+          <w:tcPr>
+            <w:tcW w:w="1127" w:type="dxa"/>
           </w:tcPr>
           <w:p>
             <w:r>
@@ -2959,7 +2972,7 @@
       <w:tr>
         <w:tc>
           <w:tcPr>
-            <w:tcW w:w="567" w:type="dxa"/>
+            <w:tcW w:w="554" w:type="dxa"/>
           </w:tcPr>
           <w:p>
             <w:r>
@@ -2969,27 +2982,37 @@
         </w:tc>
         <w:tc>
           <w:tcPr>
-            <w:tcW w:w="3118" w:type="dxa"/>
-          </w:tcPr>
-          <w:p>
-            <w:r>
-              <w:t>Reporte de stock bajo</w:t>
-            </w:r>
-          </w:p>
-        </w:tc>
-        <w:tc>
-          <w:tcPr>
-            <w:tcW w:w="3402" w:type="dxa"/>
-          </w:tcPr>
-          <w:p>
+            <w:tcW w:w="2965" w:type="dxa"/>
+          </w:tcPr>
+          <w:p>
+            <w:pPr>
+              <w:rPr>
+                <w:lang w:val="es-CO"/>
+              </w:rPr>
+            </w:pPr>
+            <w:r>
+              <w:rPr>
+                <w:lang w:val="es-CO"/>
+              </w:rPr>
+              <w:t>Reporte de préstamos activos y vencidos</w:t>
+            </w:r>
+          </w:p>
+        </w:tc>
+        <w:tc>
+          <w:tcPr>
+            <w:tcW w:w="3224" w:type="dxa"/>
+          </w:tcPr>
+          <w:p>
+            <w:proofErr w:type="spellStart"/>
             <w:r>
               <w:t>ninguna</w:t>
             </w:r>
-          </w:p>
-        </w:tc>
-        <w:tc>
-          <w:tcPr>
-            <w:tcW w:w="1701" w:type="dxa"/>
+            <w:proofErr w:type="spellEnd"/>
+          </w:p>
+        </w:tc>
+        <w:tc>
+          <w:tcPr>
+            <w:tcW w:w="1629" w:type="dxa"/>
           </w:tcPr>
           <w:p>
             <w:r>
@@ -2999,7 +3022,7 @@
         </w:tc>
         <w:tc>
           <w:tcPr>
-            <w:tcW w:w="4535" w:type="dxa"/>
+            <w:tcW w:w="4289" w:type="dxa"/>
           </w:tcPr>
           <w:p>
             <w:pPr>
@@ -3011,13 +3034,13 @@
               <w:rPr>
                 <w:lang w:val="es-CO"/>
               </w:rPr>
-              <w:t>Lista las herramientas con menos de 3 unidades.</w:t>
-            </w:r>
-          </w:p>
-        </w:tc>
-        <w:tc>
-          <w:tcPr>
-            <w:tcW w:w="1134" w:type="dxa"/>
+              <w:t>Separa activos y vencidos, y marca los vencidos.</w:t>
+            </w:r>
+          </w:p>
+        </w:tc>
+        <w:tc>
+          <w:tcPr>
+            <w:tcW w:w="1127" w:type="dxa"/>
           </w:tcPr>
           <w:p>
             <w:r>
@@ -3029,7 +3052,7 @@
       <w:tr>
         <w:tc>
           <w:tcPr>
-            <w:tcW w:w="567" w:type="dxa"/>
+            <w:tcW w:w="554" w:type="dxa"/>
           </w:tcPr>
           <w:p>
             <w:r>
@@ -3039,7 +3062,7 @@
         </w:tc>
         <w:tc>
           <w:tcPr>
-            <w:tcW w:w="3118" w:type="dxa"/>
+            <w:tcW w:w="2965" w:type="dxa"/>
           </w:tcPr>
           <w:p>
             <w:pPr>
@@ -3051,47 +3074,41 @@
               <w:rPr>
                 <w:lang w:val="es-CO"/>
               </w:rPr>
-              <w:t xml:space="preserve">Reporte de </w:t>
-            </w:r>
-            <w:r>
-              <w:rPr>
-                <w:lang w:val="es-CO"/>
-              </w:rPr>
-              <w:t>préstamos</w:t>
-            </w:r>
-            <w:r>
-              <w:rPr>
-                <w:lang w:val="es-CO"/>
-              </w:rPr>
-              <w:t xml:space="preserve"> activos y vencidos</w:t>
-            </w:r>
-          </w:p>
-        </w:tc>
-        <w:tc>
-          <w:tcPr>
-            <w:tcW w:w="3402" w:type="dxa"/>
-          </w:tcPr>
-          <w:p>
+              <w:t>Reporte de historial de un usuario sin prestamos</w:t>
+            </w:r>
+          </w:p>
+        </w:tc>
+        <w:tc>
+          <w:tcPr>
+            <w:tcW w:w="3224" w:type="dxa"/>
+          </w:tcPr>
+          <w:p>
+            <w:r>
+              <w:t xml:space="preserve">id del </w:t>
+            </w:r>
             <w:proofErr w:type="spellStart"/>
             <w:r>
-              <w:t>ninguna</w:t>
+              <w:t>usuario</w:t>
             </w:r>
             <w:proofErr w:type="spellEnd"/>
-          </w:p>
-        </w:tc>
-        <w:tc>
-          <w:tcPr>
-            <w:tcW w:w="1701" w:type="dxa"/>
-          </w:tcPr>
-          <w:p>
-            <w:r>
-              <w:t>-</w:t>
-            </w:r>
-          </w:p>
-        </w:tc>
-        <w:tc>
-          <w:tcPr>
-            <w:tcW w:w="4535" w:type="dxa"/>
+            <w:r>
+              <w:t xml:space="preserve"> = 2</w:t>
+            </w:r>
+          </w:p>
+        </w:tc>
+        <w:tc>
+          <w:tcPr>
+            <w:tcW w:w="1629" w:type="dxa"/>
+          </w:tcPr>
+          <w:p>
+            <w:r>
+              <w:t>int</w:t>
+            </w:r>
+          </w:p>
+        </w:tc>
+        <w:tc>
+          <w:tcPr>
+            <w:tcW w:w="4289" w:type="dxa"/>
           </w:tcPr>
           <w:p>
             <w:pPr>
@@ -3103,13 +3120,27 @@
               <w:rPr>
                 <w:lang w:val="es-CO"/>
               </w:rPr>
-              <w:t>Separa activos y vencidos, y marca los vencidos.</w:t>
-            </w:r>
-          </w:p>
-        </w:tc>
-        <w:tc>
-          <w:tcPr>
-            <w:tcW w:w="1134" w:type="dxa"/>
+              <w:t xml:space="preserve">Este usuario no tiene </w:t>
+            </w:r>
+            <w:proofErr w:type="spellStart"/>
+            <w:r>
+              <w:rPr>
+                <w:lang w:val="es-CO"/>
+              </w:rPr>
+              <w:t>prestamos</w:t>
+            </w:r>
+            <w:proofErr w:type="spellEnd"/>
+            <w:r>
+              <w:rPr>
+                <w:lang w:val="es-CO"/>
+              </w:rPr>
+              <w:t>.</w:t>
+            </w:r>
+          </w:p>
+        </w:tc>
+        <w:tc>
+          <w:tcPr>
+            <w:tcW w:w="1127" w:type="dxa"/>
           </w:tcPr>
           <w:p>
             <w:r>
@@ -3121,7 +3152,7 @@
       <w:tr>
         <w:tc>
           <w:tcPr>
-            <w:tcW w:w="567" w:type="dxa"/>
+            <w:tcW w:w="554" w:type="dxa"/>
           </w:tcPr>
           <w:p>
             <w:r>
@@ -3131,7 +3162,7 @@
         </w:tc>
         <w:tc>
           <w:tcPr>
-            <w:tcW w:w="3118" w:type="dxa"/>
+            <w:tcW w:w="2965" w:type="dxa"/>
           </w:tcPr>
           <w:p>
             <w:pPr>
@@ -3143,31 +3174,56 @@
               <w:rPr>
                 <w:lang w:val="es-CO"/>
               </w:rPr>
-              <w:t>Reporte de historial de un usuario sin prestamos</w:t>
-            </w:r>
-          </w:p>
-        </w:tc>
-        <w:tc>
-          <w:tcPr>
-            <w:tcW w:w="3402" w:type="dxa"/>
-          </w:tcPr>
-          <w:p>
-            <w:r>
-              <w:t xml:space="preserve">id del </w:t>
+              <w:t xml:space="preserve">Escoger una </w:t>
             </w:r>
             <w:proofErr w:type="spellStart"/>
             <w:r>
-              <w:t>usuario</w:t>
+              <w:rPr>
+                <w:lang w:val="es-CO"/>
+              </w:rPr>
+              <w:t>opcion</w:t>
             </w:r>
             <w:proofErr w:type="spellEnd"/>
             <w:r>
-              <w:t xml:space="preserve"> = 2</w:t>
-            </w:r>
-          </w:p>
-        </w:tc>
-        <w:tc>
-          <w:tcPr>
-            <w:tcW w:w="1701" w:type="dxa"/>
+              <w:rPr>
+                <w:lang w:val="es-CO"/>
+              </w:rPr>
+              <w:t xml:space="preserve"> de </w:t>
+            </w:r>
+            <w:proofErr w:type="spellStart"/>
+            <w:r>
+              <w:rPr>
+                <w:lang w:val="es-CO"/>
+              </w:rPr>
+              <w:t>menu</w:t>
+            </w:r>
+            <w:proofErr w:type="spellEnd"/>
+            <w:r>
+              <w:rPr>
+                <w:lang w:val="es-CO"/>
+              </w:rPr>
+              <w:t xml:space="preserve"> que no existe</w:t>
+            </w:r>
+          </w:p>
+        </w:tc>
+        <w:tc>
+          <w:tcPr>
+            <w:tcW w:w="3224" w:type="dxa"/>
+          </w:tcPr>
+          <w:p>
+            <w:proofErr w:type="spellStart"/>
+            <w:r>
+              <w:t>opcion</w:t>
+            </w:r>
+            <w:proofErr w:type="spellEnd"/>
+            <w:r>
+              <w:t xml:space="preserve"> = 9</w:t>
+            </w:r>
+          </w:p>
+        </w:tc>
+        <w:tc>
+          <w:tcPr>
+            <w:tcW w:w="1629" w:type="dxa"/>
           </w:tcPr>
           <w:p>
             <w:r>
@@ -3177,7 +3233,7 @@
         </w:tc>
         <w:tc>
           <w:tcPr>
-            <w:tcW w:w="4535" w:type="dxa"/>
+            <w:tcW w:w="4289" w:type="dxa"/>
           </w:tcPr>
           <w:p>
             <w:pPr>
@@ -3185,31 +3241,39 @@
                 <w:lang w:val="es-CO"/>
               </w:rPr>
             </w:pPr>
-            <w:r>
-              <w:rPr>
-                <w:lang w:val="es-CO"/>
-              </w:rPr>
-              <w:t xml:space="preserve">Este usuario no tiene </w:t>
-            </w:r>
             <w:proofErr w:type="spellStart"/>
             <w:r>
               <w:rPr>
                 <w:lang w:val="es-CO"/>
               </w:rPr>
-              <w:t>prestamos</w:t>
+              <w:t>Opcion</w:t>
             </w:r>
             <w:proofErr w:type="spellEnd"/>
             <w:r>
               <w:rPr>
                 <w:lang w:val="es-CO"/>
               </w:rPr>
+              <w:t xml:space="preserve"> invalida. Vuelve a mostrar el </w:t>
+            </w:r>
+            <w:proofErr w:type="spellStart"/>
+            <w:r>
+              <w:rPr>
+                <w:lang w:val="es-CO"/>
+              </w:rPr>
+              <w:t>menu</w:t>
+            </w:r>
+            <w:proofErr w:type="spellEnd"/>
+            <w:r>
+              <w:rPr>
+                <w:lang w:val="es-CO"/>
+              </w:rPr>
               <w:t>.</w:t>
             </w:r>
           </w:p>
         </w:tc>
         <w:tc>
           <w:tcPr>
-            <w:tcW w:w="1134" w:type="dxa"/>
+            <w:tcW w:w="1127" w:type="dxa"/>
           </w:tcPr>
           <w:p>
             <w:r>
@@ -3221,17 +3285,13 @@
       <w:tr>
         <w:tc>
           <w:tcPr>
-            <w:tcW w:w="567" w:type="dxa"/>
-          </w:tcPr>
-          <w:p>
-            <w:r>
-              <w:t>30</w:t>
-            </w:r>
-          </w:p>
-        </w:tc>
-        <w:tc>
-          <w:tcPr>
-            <w:tcW w:w="3118" w:type="dxa"/>
+            <w:tcW w:w="554" w:type="dxa"/>
+          </w:tcPr>
+          <w:p/>
+        </w:tc>
+        <w:tc>
+          <w:tcPr>
+            <w:tcW w:w="2965" w:type="dxa"/>
           </w:tcPr>
           <w:p>
             <w:pPr>
@@ -3239,70 +3299,23 @@
                 <w:lang w:val="es-CO"/>
               </w:rPr>
             </w:pPr>
-            <w:r>
-              <w:rPr>
-                <w:lang w:val="es-CO"/>
-              </w:rPr>
-              <w:t xml:space="preserve">Escoger una </w:t>
-            </w:r>
-            <w:proofErr w:type="spellStart"/>
-            <w:r>
-              <w:rPr>
-                <w:lang w:val="es-CO"/>
-              </w:rPr>
-              <w:t>opcion</w:t>
-            </w:r>
-            <w:proofErr w:type="spellEnd"/>
-            <w:r>
-              <w:rPr>
-                <w:lang w:val="es-CO"/>
-              </w:rPr>
-              <w:t xml:space="preserve"> de </w:t>
-            </w:r>
-            <w:proofErr w:type="spellStart"/>
-            <w:r>
-              <w:rPr>
-                <w:lang w:val="es-CO"/>
-              </w:rPr>
-              <w:t>menu</w:t>
-            </w:r>
-            <w:proofErr w:type="spellEnd"/>
-            <w:r>
-              <w:rPr>
-                <w:lang w:val="es-CO"/>
-              </w:rPr>
-              <w:t xml:space="preserve"> que no existe</w:t>
-            </w:r>
-          </w:p>
-        </w:tc>
-        <w:tc>
-          <w:tcPr>
-            <w:tcW w:w="3402" w:type="dxa"/>
-          </w:tcPr>
-          <w:p>
-            <w:proofErr w:type="spellStart"/>
-            <w:r>
-              <w:t>opcion</w:t>
-            </w:r>
-            <w:proofErr w:type="spellEnd"/>
-            <w:r>
-              <w:t xml:space="preserve"> = 9</w:t>
-            </w:r>
-          </w:p>
-        </w:tc>
-        <w:tc>
-          <w:tcPr>
-            <w:tcW w:w="1701" w:type="dxa"/>
-          </w:tcPr>
-          <w:p>
-            <w:r>
-              <w:t>int</w:t>
-            </w:r>
-          </w:p>
-        </w:tc>
-        <w:tc>
-          <w:tcPr>
-            <w:tcW w:w="4535" w:type="dxa"/>
+          </w:p>
+        </w:tc>
+        <w:tc>
+          <w:tcPr>
+            <w:tcW w:w="3224" w:type="dxa"/>
+          </w:tcPr>
+          <w:p/>
+        </w:tc>
+        <w:tc>
+          <w:tcPr>
+            <w:tcW w:w="1629" w:type="dxa"/>
+          </w:tcPr>
+          <w:p/>
+        </w:tc>
+        <w:tc>
+          <w:tcPr>
+            <w:tcW w:w="4289" w:type="dxa"/>
           </w:tcPr>
           <w:p>
             <w:pPr>
@@ -3310,45 +3323,13 @@
                 <w:lang w:val="es-CO"/>
               </w:rPr>
             </w:pPr>
-            <w:proofErr w:type="spellStart"/>
-            <w:r>
-              <w:rPr>
-                <w:lang w:val="es-CO"/>
-              </w:rPr>
-              <w:t>Opcion</w:t>
-            </w:r>
-            <w:proofErr w:type="spellEnd"/>
-            <w:r>
-              <w:rPr>
-                <w:lang w:val="es-CO"/>
-              </w:rPr>
-              <w:t xml:space="preserve"> invalida. Vuelve a mostrar el </w:t>
-            </w:r>
-            <w:proofErr w:type="spellStart"/>
-            <w:r>
-              <w:rPr>
-                <w:lang w:val="es-CO"/>
-              </w:rPr>
-              <w:t>menu</w:t>
-            </w:r>
-            <w:proofErr w:type="spellEnd"/>
-            <w:r>
-              <w:rPr>
-                <w:lang w:val="es-CO"/>
-              </w:rPr>
-              <w:t>.</w:t>
-            </w:r>
-          </w:p>
-        </w:tc>
-        <w:tc>
-          <w:tcPr>
-            <w:tcW w:w="1134" w:type="dxa"/>
-          </w:tcPr>
-          <w:p>
-            <w:r>
-              <w:t>OK</w:t>
-            </w:r>
-          </w:p>
+          </w:p>
+        </w:tc>
+        <w:tc>
+          <w:tcPr>
+            <w:tcW w:w="1127" w:type="dxa"/>
+          </w:tcPr>
+          <w:p/>
         </w:tc>
       </w:tr>
     </w:tbl>

</xml_diff>